<commit_message>
feat: logo de Valen y promo 50% en precios
</commit_message>
<xml_diff>
--- a/docs/arquitectura.docx
+++ b/docs/arquitectura.docx
@@ -310,7 +310,7 @@
                 <w:color w:val="5A5A5A"/>
                 <w:sz w:val="19"/>
               </w:rPr>
-              <w:t>1.1</w:t>
+              <w:t>1.2</w:t>
             </w:r>
           </w:p>
         </w:tc>
@@ -400,7 +400,7 @@
       <w:pPr>
         <w:pStyle w:val="Ttulo1"/>
       </w:pPr>
-      <w:bookmarkStart w:id="0" w:name="_Toc243644292"/>
+      <w:bookmarkStart w:id="0" w:name="_Toc243647070"/>
       <w:r>
         <w:lastRenderedPageBreak/>
         <w:t>Índice</w:t>
@@ -452,7 +452,7 @@
         <w:rPr>
           <w:noProof/>
         </w:rPr>
-        <w:instrText xml:space="preserve"> PAGEREF _Toc243644292 \h </w:instrText>
+        <w:instrText xml:space="preserve"> PAGEREF _Toc243647070 \h </w:instrText>
       </w:r>
       <w:r>
         <w:rPr>
@@ -514,7 +514,7 @@
         <w:rPr>
           <w:noProof/>
         </w:rPr>
-        <w:instrText xml:space="preserve"> PAGEREF _Toc243644293 \h </w:instrText>
+        <w:instrText xml:space="preserve"> PAGEREF _Toc243647071 \h </w:instrText>
       </w:r>
       <w:r>
         <w:rPr>
@@ -576,7 +576,7 @@
         <w:rPr>
           <w:noProof/>
         </w:rPr>
-        <w:instrText xml:space="preserve"> PAGEREF _Toc243644294 \h </w:instrText>
+        <w:instrText xml:space="preserve"> PAGEREF _Toc243647072 \h </w:instrText>
       </w:r>
       <w:r>
         <w:rPr>
@@ -634,7 +634,7 @@
         <w:rPr>
           <w:noProof/>
         </w:rPr>
-        <w:instrText xml:space="preserve"> PAGEREF _Toc243644295 \h </w:instrText>
+        <w:instrText xml:space="preserve"> PAGEREF _Toc243647073 \h </w:instrText>
       </w:r>
       <w:r>
         <w:rPr>
@@ -696,7 +696,7 @@
         <w:rPr>
           <w:noProof/>
         </w:rPr>
-        <w:instrText xml:space="preserve"> PAGEREF _Toc243644296 \h </w:instrText>
+        <w:instrText xml:space="preserve"> PAGEREF _Toc243647074 \h </w:instrText>
       </w:r>
       <w:r>
         <w:rPr>
@@ -758,7 +758,7 @@
         <w:rPr>
           <w:noProof/>
         </w:rPr>
-        <w:instrText xml:space="preserve"> PAGEREF _Toc243644297 \h </w:instrText>
+        <w:instrText xml:space="preserve"> PAGEREF _Toc243647075 \h </w:instrText>
       </w:r>
       <w:r>
         <w:rPr>
@@ -816,7 +816,7 @@
         <w:rPr>
           <w:noProof/>
         </w:rPr>
-        <w:instrText xml:space="preserve"> PAGEREF _Toc243644298 \h </w:instrText>
+        <w:instrText xml:space="preserve"> PAGEREF _Toc243647076 \h </w:instrText>
       </w:r>
       <w:r>
         <w:rPr>
@@ -878,7 +878,7 @@
         <w:rPr>
           <w:noProof/>
         </w:rPr>
-        <w:instrText xml:space="preserve"> PAGEREF _Toc243644299 \h </w:instrText>
+        <w:instrText xml:space="preserve"> PAGEREF _Toc243647077 \h </w:instrText>
       </w:r>
       <w:r>
         <w:rPr>
@@ -936,7 +936,7 @@
         <w:rPr>
           <w:noProof/>
         </w:rPr>
-        <w:instrText xml:space="preserve"> PAGEREF _Toc243644300 \h </w:instrText>
+        <w:instrText xml:space="preserve"> PAGEREF _Toc243647078 \h </w:instrText>
       </w:r>
       <w:r>
         <w:rPr>
@@ -994,7 +994,7 @@
         <w:rPr>
           <w:noProof/>
         </w:rPr>
-        <w:instrText xml:space="preserve"> PAGEREF _Toc243644301 \h </w:instrText>
+        <w:instrText xml:space="preserve"> PAGEREF _Toc243647079 \h </w:instrText>
       </w:r>
       <w:r>
         <w:rPr>
@@ -1056,7 +1056,7 @@
         <w:rPr>
           <w:noProof/>
         </w:rPr>
-        <w:instrText xml:space="preserve"> PAGEREF _Toc243644302 \h </w:instrText>
+        <w:instrText xml:space="preserve"> PAGEREF _Toc243647080 \h </w:instrText>
       </w:r>
       <w:r>
         <w:rPr>
@@ -1114,7 +1114,7 @@
         <w:rPr>
           <w:noProof/>
         </w:rPr>
-        <w:instrText xml:space="preserve"> PAGEREF _Toc243644303 \h </w:instrText>
+        <w:instrText xml:space="preserve"> PAGEREF _Toc243647081 \h </w:instrText>
       </w:r>
       <w:r>
         <w:rPr>
@@ -1172,7 +1172,7 @@
         <w:rPr>
           <w:noProof/>
         </w:rPr>
-        <w:instrText xml:space="preserve"> PAGEREF _Toc243644304 \h </w:instrText>
+        <w:instrText xml:space="preserve"> PAGEREF _Toc243647082 \h </w:instrText>
       </w:r>
       <w:r>
         <w:rPr>
@@ -1230,7 +1230,7 @@
         <w:rPr>
           <w:noProof/>
         </w:rPr>
-        <w:instrText xml:space="preserve"> PAGEREF _Toc243644305 \h </w:instrText>
+        <w:instrText xml:space="preserve"> PAGEREF _Toc243647083 \h </w:instrText>
       </w:r>
       <w:r>
         <w:rPr>
@@ -1288,7 +1288,7 @@
         <w:rPr>
           <w:noProof/>
         </w:rPr>
-        <w:instrText xml:space="preserve"> PAGEREF _Toc243644306 \h </w:instrText>
+        <w:instrText xml:space="preserve"> PAGEREF _Toc243647084 \h </w:instrText>
       </w:r>
       <w:r>
         <w:rPr>
@@ -1346,7 +1346,7 @@
         <w:rPr>
           <w:noProof/>
         </w:rPr>
-        <w:instrText xml:space="preserve"> PAGEREF _Toc243644307 \h </w:instrText>
+        <w:instrText xml:space="preserve"> PAGEREF _Toc243647085 \h </w:instrText>
       </w:r>
       <w:r>
         <w:rPr>
@@ -1404,7 +1404,7 @@
         <w:rPr>
           <w:noProof/>
         </w:rPr>
-        <w:instrText xml:space="preserve"> PAGEREF _Toc243644308 \h </w:instrText>
+        <w:instrText xml:space="preserve"> PAGEREF _Toc243647086 \h </w:instrText>
       </w:r>
       <w:r>
         <w:rPr>
@@ -1462,7 +1462,7 @@
         <w:rPr>
           <w:noProof/>
         </w:rPr>
-        <w:instrText xml:space="preserve"> PAGEREF _Toc243644309 \h </w:instrText>
+        <w:instrText xml:space="preserve"> PAGEREF _Toc243647087 \h </w:instrText>
       </w:r>
       <w:r>
         <w:rPr>
@@ -1524,7 +1524,7 @@
         <w:rPr>
           <w:noProof/>
         </w:rPr>
-        <w:instrText xml:space="preserve"> PAGEREF _Toc243644310 \h </w:instrText>
+        <w:instrText xml:space="preserve"> PAGEREF _Toc243647088 \h </w:instrText>
       </w:r>
       <w:r>
         <w:rPr>
@@ -1582,7 +1582,7 @@
         <w:rPr>
           <w:noProof/>
         </w:rPr>
-        <w:instrText xml:space="preserve"> PAGEREF _Toc243644311 \h </w:instrText>
+        <w:instrText xml:space="preserve"> PAGEREF _Toc243647089 \h </w:instrText>
       </w:r>
       <w:r>
         <w:rPr>
@@ -1640,7 +1640,7 @@
         <w:rPr>
           <w:noProof/>
         </w:rPr>
-        <w:instrText xml:space="preserve"> PAGEREF _Toc243644312 \h </w:instrText>
+        <w:instrText xml:space="preserve"> PAGEREF _Toc243647090 \h </w:instrText>
       </w:r>
       <w:r>
         <w:rPr>
@@ -1698,7 +1698,7 @@
         <w:rPr>
           <w:noProof/>
         </w:rPr>
-        <w:instrText xml:space="preserve"> PAGEREF _Toc243644313 \h </w:instrText>
+        <w:instrText xml:space="preserve"> PAGEREF _Toc243647091 \h </w:instrText>
       </w:r>
       <w:r>
         <w:rPr>
@@ -1756,7 +1756,7 @@
         <w:rPr>
           <w:noProof/>
         </w:rPr>
-        <w:instrText xml:space="preserve"> PAGEREF _Toc243644314 \h </w:instrText>
+        <w:instrText xml:space="preserve"> PAGEREF _Toc243647092 \h </w:instrText>
       </w:r>
       <w:r>
         <w:rPr>
@@ -1814,7 +1814,7 @@
         <w:rPr>
           <w:noProof/>
         </w:rPr>
-        <w:instrText xml:space="preserve"> PAGEREF _Toc243644315 \h </w:instrText>
+        <w:instrText xml:space="preserve"> PAGEREF _Toc243647093 \h </w:instrText>
       </w:r>
       <w:r>
         <w:rPr>
@@ -1876,7 +1876,7 @@
         <w:rPr>
           <w:noProof/>
         </w:rPr>
-        <w:instrText xml:space="preserve"> PAGEREF _Toc243644316 \h </w:instrText>
+        <w:instrText xml:space="preserve"> PAGEREF _Toc243647094 \h </w:instrText>
       </w:r>
       <w:r>
         <w:rPr>
@@ -1934,7 +1934,7 @@
         <w:rPr>
           <w:noProof/>
         </w:rPr>
-        <w:instrText xml:space="preserve"> PAGEREF _Toc243644317 \h </w:instrText>
+        <w:instrText xml:space="preserve"> PAGEREF _Toc243647095 \h </w:instrText>
       </w:r>
       <w:r>
         <w:rPr>
@@ -1992,7 +1992,7 @@
         <w:rPr>
           <w:noProof/>
         </w:rPr>
-        <w:instrText xml:space="preserve"> PAGEREF _Toc243644318 \h </w:instrText>
+        <w:instrText xml:space="preserve"> PAGEREF _Toc243647096 \h </w:instrText>
       </w:r>
       <w:r>
         <w:rPr>
@@ -2054,7 +2054,7 @@
         <w:rPr>
           <w:noProof/>
         </w:rPr>
-        <w:instrText xml:space="preserve"> PAGEREF _Toc243644319 \h </w:instrText>
+        <w:instrText xml:space="preserve"> PAGEREF _Toc243647097 \h </w:instrText>
       </w:r>
       <w:r>
         <w:rPr>
@@ -2112,7 +2112,7 @@
         <w:rPr>
           <w:noProof/>
         </w:rPr>
-        <w:instrText xml:space="preserve"> PAGEREF _Toc243644320 \h </w:instrText>
+        <w:instrText xml:space="preserve"> PAGEREF _Toc243647098 \h </w:instrText>
       </w:r>
       <w:r>
         <w:rPr>
@@ -2170,7 +2170,7 @@
         <w:rPr>
           <w:noProof/>
         </w:rPr>
-        <w:instrText xml:space="preserve"> PAGEREF _Toc243644321 \h </w:instrText>
+        <w:instrText xml:space="preserve"> PAGEREF _Toc243647099 \h </w:instrText>
       </w:r>
       <w:r>
         <w:rPr>
@@ -2228,7 +2228,7 @@
         <w:rPr>
           <w:noProof/>
         </w:rPr>
-        <w:instrText xml:space="preserve"> PAGEREF _Toc243644322 \h </w:instrText>
+        <w:instrText xml:space="preserve"> PAGEREF _Toc243647100 \h </w:instrText>
       </w:r>
       <w:r>
         <w:rPr>
@@ -2286,7 +2286,7 @@
         <w:rPr>
           <w:noProof/>
         </w:rPr>
-        <w:instrText xml:space="preserve"> PAGEREF _Toc243644323 \h </w:instrText>
+        <w:instrText xml:space="preserve"> PAGEREF _Toc243647101 \h </w:instrText>
       </w:r>
       <w:r>
         <w:rPr>
@@ -2344,7 +2344,7 @@
         <w:rPr>
           <w:noProof/>
         </w:rPr>
-        <w:instrText xml:space="preserve"> PAGEREF _Toc243644324 \h </w:instrText>
+        <w:instrText xml:space="preserve"> PAGEREF _Toc243647102 \h </w:instrText>
       </w:r>
       <w:r>
         <w:rPr>
@@ -2406,7 +2406,7 @@
         <w:rPr>
           <w:noProof/>
         </w:rPr>
-        <w:instrText xml:space="preserve"> PAGEREF _Toc243644325 \h </w:instrText>
+        <w:instrText xml:space="preserve"> PAGEREF _Toc243647103 \h </w:instrText>
       </w:r>
       <w:r>
         <w:rPr>
@@ -2464,7 +2464,7 @@
         <w:rPr>
           <w:noProof/>
         </w:rPr>
-        <w:instrText xml:space="preserve"> PAGEREF _Toc243644326 \h </w:instrText>
+        <w:instrText xml:space="preserve"> PAGEREF _Toc243647104 \h </w:instrText>
       </w:r>
       <w:r>
         <w:rPr>
@@ -2523,7 +2523,7 @@
         <w:rPr>
           <w:noProof/>
         </w:rPr>
-        <w:instrText xml:space="preserve"> PAGEREF _Toc243644327 \h </w:instrText>
+        <w:instrText xml:space="preserve"> PAGEREF _Toc243647105 \h </w:instrText>
       </w:r>
       <w:r>
         <w:rPr>
@@ -2585,7 +2585,7 @@
         <w:rPr>
           <w:noProof/>
         </w:rPr>
-        <w:instrText xml:space="preserve"> PAGEREF _Toc243644328 \h </w:instrText>
+        <w:instrText xml:space="preserve"> PAGEREF _Toc243647106 \h </w:instrText>
       </w:r>
       <w:r>
         <w:rPr>
@@ -2643,7 +2643,7 @@
         <w:rPr>
           <w:noProof/>
         </w:rPr>
-        <w:instrText xml:space="preserve"> PAGEREF _Toc243644329 \h </w:instrText>
+        <w:instrText xml:space="preserve"> PAGEREF _Toc243647107 \h </w:instrText>
       </w:r>
       <w:r>
         <w:rPr>
@@ -2705,7 +2705,7 @@
         <w:rPr>
           <w:noProof/>
         </w:rPr>
-        <w:instrText xml:space="preserve"> PAGEREF _Toc243644330 \h </w:instrText>
+        <w:instrText xml:space="preserve"> PAGEREF _Toc243647108 \h </w:instrText>
       </w:r>
       <w:r>
         <w:rPr>
@@ -2767,7 +2767,7 @@
         <w:rPr>
           <w:noProof/>
         </w:rPr>
-        <w:instrText xml:space="preserve"> PAGEREF _Toc243644331 \h </w:instrText>
+        <w:instrText xml:space="preserve"> PAGEREF _Toc243647109 \h </w:instrText>
       </w:r>
       <w:r>
         <w:rPr>
@@ -2825,7 +2825,7 @@
         <w:rPr>
           <w:noProof/>
         </w:rPr>
-        <w:instrText xml:space="preserve"> PAGEREF _Toc243644332 \h </w:instrText>
+        <w:instrText xml:space="preserve"> PAGEREF _Toc243647110 \h </w:instrText>
       </w:r>
       <w:r>
         <w:rPr>
@@ -2883,7 +2883,7 @@
         <w:rPr>
           <w:noProof/>
         </w:rPr>
-        <w:instrText xml:space="preserve"> PAGEREF _Toc243644333 \h </w:instrText>
+        <w:instrText xml:space="preserve"> PAGEREF _Toc243647111 \h </w:instrText>
       </w:r>
       <w:r>
         <w:rPr>
@@ -2941,7 +2941,7 @@
         <w:rPr>
           <w:noProof/>
         </w:rPr>
-        <w:instrText xml:space="preserve"> PAGEREF _Toc243644334 \h </w:instrText>
+        <w:instrText xml:space="preserve"> PAGEREF _Toc243647112 \h </w:instrText>
       </w:r>
       <w:r>
         <w:rPr>
@@ -2999,7 +2999,7 @@
         <w:rPr>
           <w:noProof/>
         </w:rPr>
-        <w:instrText xml:space="preserve"> PAGEREF _Toc243644335 \h </w:instrText>
+        <w:instrText xml:space="preserve"> PAGEREF _Toc243647113 \h </w:instrText>
       </w:r>
       <w:r>
         <w:rPr>
@@ -3061,7 +3061,7 @@
         <w:rPr>
           <w:noProof/>
         </w:rPr>
-        <w:instrText xml:space="preserve"> PAGEREF _Toc243644336 \h </w:instrText>
+        <w:instrText xml:space="preserve"> PAGEREF _Toc243647114 \h </w:instrText>
       </w:r>
       <w:r>
         <w:rPr>
@@ -3123,7 +3123,7 @@
         <w:rPr>
           <w:noProof/>
         </w:rPr>
-        <w:instrText xml:space="preserve"> PAGEREF _Toc243644337 \h </w:instrText>
+        <w:instrText xml:space="preserve"> PAGEREF _Toc243647115 \h </w:instrText>
       </w:r>
       <w:r>
         <w:rPr>
@@ -3172,7 +3172,7 @@
       <w:pPr>
         <w:pStyle w:val="Ttulo1"/>
       </w:pPr>
-      <w:bookmarkStart w:id="1" w:name="_Toc243644293"/>
+      <w:bookmarkStart w:id="1" w:name="_Toc243647071"/>
       <w:r>
         <w:lastRenderedPageBreak/>
         <w:t>1. Resumen ejecutivo</w:t>
@@ -3357,7 +3357,7 @@
       <w:pPr>
         <w:pStyle w:val="Ttulo1"/>
       </w:pPr>
-      <w:bookmarkStart w:id="2" w:name="_Toc243644294"/>
+      <w:bookmarkStart w:id="2" w:name="_Toc243647072"/>
       <w:r>
         <w:lastRenderedPageBreak/>
         <w:t>2. Accesos y entornos</w:t>
@@ -3979,7 +3979,7 @@
       <w:pPr>
         <w:pStyle w:val="Ttulo2"/>
       </w:pPr>
-      <w:bookmarkStart w:id="3" w:name="_Toc243644295"/>
+      <w:bookmarkStart w:id="3" w:name="_Toc243647073"/>
       <w:r>
         <w:t>2.1 Credenciales del panel</w:t>
       </w:r>
@@ -4117,7 +4117,7 @@
       <w:pPr>
         <w:pStyle w:val="Ttulo1"/>
       </w:pPr>
-      <w:bookmarkStart w:id="4" w:name="_Toc243644296"/>
+      <w:bookmarkStart w:id="4" w:name="_Toc243647074"/>
       <w:r>
         <w:lastRenderedPageBreak/>
         <w:t>3. Stack tecnológico</w:t>
@@ -5229,7 +5229,7 @@
       <w:pPr>
         <w:pStyle w:val="Ttulo1"/>
       </w:pPr>
-      <w:bookmarkStart w:id="5" w:name="_Toc243644297"/>
+      <w:bookmarkStart w:id="5" w:name="_Toc243647075"/>
       <w:r>
         <w:lastRenderedPageBreak/>
         <w:t>4. Estructura del repositorio</w:t>
@@ -5668,7 +5668,7 @@
       <w:pPr>
         <w:pStyle w:val="Ttulo2"/>
       </w:pPr>
-      <w:bookmarkStart w:id="6" w:name="_Toc243644298"/>
+      <w:bookmarkStart w:id="6" w:name="_Toc243647076"/>
       <w:r>
         <w:t>4.1 Archivos principales</w:t>
       </w:r>
@@ -6831,7 +6831,7 @@
       <w:pPr>
         <w:pStyle w:val="Ttulo1"/>
       </w:pPr>
-      <w:bookmarkStart w:id="7" w:name="_Toc243644299"/>
+      <w:bookmarkStart w:id="7" w:name="_Toc243647077"/>
       <w:r>
         <w:lastRenderedPageBreak/>
         <w:t>5. Arquitectura general</w:t>
@@ -7256,7 +7256,7 @@
       <w:pPr>
         <w:pStyle w:val="Ttulo2"/>
       </w:pPr>
-      <w:bookmarkStart w:id="8" w:name="_Toc243644300"/>
+      <w:bookmarkStart w:id="8" w:name="_Toc243647078"/>
       <w:r>
         <w:t>5.1 Flujo de una visita</w:t>
       </w:r>
@@ -7354,7 +7354,7 @@
       <w:pPr>
         <w:pStyle w:val="Ttulo2"/>
       </w:pPr>
-      <w:bookmarkStart w:id="9" w:name="_Toc243644301"/>
+      <w:bookmarkStart w:id="9" w:name="_Toc243647079"/>
       <w:r>
         <w:t>5.2 Flujo de publicación</w:t>
       </w:r>
@@ -7477,7 +7477,7 @@
       <w:pPr>
         <w:pStyle w:val="Ttulo1"/>
       </w:pPr>
-      <w:bookmarkStart w:id="10" w:name="_Toc243644302"/>
+      <w:bookmarkStart w:id="10" w:name="_Toc243647080"/>
       <w:r>
         <w:lastRenderedPageBreak/>
         <w:t>6. Frontend</w:t>
@@ -7488,7 +7488,7 @@
       <w:pPr>
         <w:pStyle w:val="Ttulo2"/>
       </w:pPr>
-      <w:bookmarkStart w:id="11" w:name="_Toc243644303"/>
+      <w:bookmarkStart w:id="11" w:name="_Toc243647081"/>
       <w:r>
         <w:t>6.1 Entradas y build</w:t>
       </w:r>
@@ -7819,7 +7819,7 @@
       <w:pPr>
         <w:pStyle w:val="Ttulo2"/>
       </w:pPr>
-      <w:bookmarkStart w:id="12" w:name="_Toc243644304"/>
+      <w:bookmarkStart w:id="12" w:name="_Toc243647082"/>
       <w:r>
         <w:t>6.2 Componentes</w:t>
       </w:r>
@@ -8150,7 +8150,7 @@
                 <w:rFonts w:cs="Calibri"/>
                 <w:sz w:val="18"/>
               </w:rPr>
-              <w:t>Planes Bootcamp y Anual, precios por divisa y botón de inscripción.</w:t>
+              <w:t>Planes Bootcamp y Anual, precios por divisa, etiqueta «Promo 50% desc.» con el doble tachado y botón de inscripción.</w:t>
             </w:r>
           </w:p>
         </w:tc>
@@ -8416,9 +8416,50 @@
     </w:p>
     <w:p>
       <w:pPr>
+        <w:shd w:val="clear" w:color="auto" w:fill="FFFFFF"/>
+        <w:jc w:val="both"/>
+        <w:rPr>
+          <w:rFonts w:cs="Calibri"/>
+        </w:rPr>
+      </w:pPr>
+      <w:r>
+        <w:rPr>
+          <w:rFonts w:cs="Calibri"/>
+        </w:rPr>
+        <w:t xml:space="preserve">En cada tarjeta de Precios, sobre el importe, se muestra la etiqueta </w:t>
+      </w:r>
+      <w:r>
+        <w:rPr>
+          <w:rFonts w:cs="Calibri"/>
+          <w:b/>
+        </w:rPr>
+        <w:t>«Promo 50% desc.»</w:t>
+      </w:r>
+      <w:r>
+        <w:rPr>
+          <w:rFonts w:cs="Calibri"/>
+        </w:rPr>
+        <w:t xml:space="preserve"> con el </w:t>
+      </w:r>
+      <w:r>
+        <w:rPr>
+          <w:rFonts w:cs="Calibri"/>
+          <w:b/>
+        </w:rPr>
+        <w:t>doble del precio tachado</w:t>
+      </w:r>
+      <w:r>
+        <w:rPr>
+          <w:rFonts w:cs="Calibri"/>
+        </w:rPr>
+        <w:t>: por ejemplo, si el plan vale $49.999 ARS, la etiqueta muestra (99.998) tachado. El cálculo es visual y en el navegador: el monto que se envía al modal de pago sigue siendo el precio publicado.</w:t>
+      </w:r>
+    </w:p>
+    <w:p>
+      <w:pPr>
         <w:pStyle w:val="Ttulo2"/>
       </w:pPr>
-      <w:bookmarkStart w:id="13" w:name="_Toc243644305"/>
+      <w:bookmarkStart w:id="13" w:name="_Toc243647083"/>
       <w:r>
         <w:t>6.3 Estado y datos</w:t>
       </w:r>
@@ -8493,6 +8534,7 @@
         <w:rPr>
           <w:rFonts w:cs="Calibri"/>
         </w:rPr>
+        <w:lastRenderedPageBreak/>
         <w:t xml:space="preserve">•  </w:t>
       </w:r>
       <w:r>
@@ -8563,7 +8605,6 @@
         <w:rPr>
           <w:rFonts w:cs="Calibri"/>
         </w:rPr>
-        <w:lastRenderedPageBreak/>
         <w:t xml:space="preserve">•  </w:t>
       </w:r>
       <w:r>
@@ -8626,7 +8667,7 @@
       <w:pPr>
         <w:pStyle w:val="Ttulo2"/>
       </w:pPr>
-      <w:bookmarkStart w:id="14" w:name="_Toc243644306"/>
+      <w:bookmarkStart w:id="14" w:name="_Toc243647084"/>
       <w:r>
         <w:t>6.4 Contenido editable</w:t>
       </w:r>
@@ -8684,6 +8725,21 @@
           <w:rFonts w:cs="Calibri"/>
         </w:rPr>
         <w:t xml:space="preserve"> (las 7 URLs del collage).</w:t>
+      </w:r>
+    </w:p>
+    <w:p>
+      <w:pPr>
+        <w:shd w:val="clear" w:color="auto" w:fill="FFFFFF"/>
+        <w:jc w:val="both"/>
+        <w:rPr>
+          <w:rFonts w:cs="Calibri"/>
+        </w:rPr>
+      </w:pPr>
+      <w:r>
+        <w:rPr>
+          <w:rFonts w:cs="Calibri"/>
+        </w:rPr>
+        <w:t>La etiqueta de promo de Precios no se guarda en KV: se calcula al vuelo duplicando el importe publicado y respetando su formato (símbolo y separador de miles, tanto en USD como en ARS). Así, cualquier cambio de precio hecho desde el panel actualiza la promo sin deploy.</w:t>
       </w:r>
     </w:p>
     <w:p>
@@ -8905,7 +8961,7 @@
       <w:pPr>
         <w:pStyle w:val="Ttulo2"/>
       </w:pPr>
-      <w:bookmarkStart w:id="15" w:name="_Toc243644307"/>
+      <w:bookmarkStart w:id="15" w:name="_Toc243647085"/>
       <w:r>
         <w:t>6.5 Diseño, tipografías y estilos</w:t>
       </w:r>
@@ -9474,7 +9530,7 @@
       <w:pPr>
         <w:pStyle w:val="Ttulo2"/>
       </w:pPr>
-      <w:bookmarkStart w:id="16" w:name="_Toc243644308"/>
+      <w:bookmarkStart w:id="16" w:name="_Toc243647086"/>
       <w:r>
         <w:t>6.6 Imágenes, video y rutas</w:t>
       </w:r>
@@ -9609,7 +9665,7 @@
                 <w:rFonts w:cs="Calibri"/>
                 <w:sz w:val="18"/>
               </w:rPr>
-              <w:t>/images/logo.png</w:t>
+              <w:t>/images/logo_valen.jpeg</w:t>
             </w:r>
           </w:p>
         </w:tc>
@@ -9630,7 +9686,7 @@
                 <w:rFonts w:cs="Calibri"/>
                 <w:sz w:val="18"/>
               </w:rPr>
-              <w:t>64 KB</w:t>
+              <w:t>135 KB</w:t>
             </w:r>
           </w:p>
         </w:tc>
@@ -9651,7 +9707,7 @@
                 <w:rFonts w:cs="Calibri"/>
                 <w:sz w:val="18"/>
               </w:rPr>
-              <w:t>Logo del Navbar y del Footer (500x500).</w:t>
+              <w:t>Logo del Navbar y del Footer (1254x1254).</w:t>
             </w:r>
           </w:p>
         </w:tc>
@@ -9680,6 +9736,7 @@
                 <w:rFonts w:cs="Calibri"/>
                 <w:sz w:val="18"/>
               </w:rPr>
+              <w:lastRenderedPageBreak/>
               <w:t>/images/user/totalhiit_1..8.jpg</w:t>
             </w:r>
           </w:p>
@@ -10035,7 +10092,6 @@
                 <w:rFonts w:cs="Calibri"/>
                 <w:sz w:val="18"/>
               </w:rPr>
-              <w:lastRenderedPageBreak/>
               <w:t>/vite.svg</w:t>
             </w:r>
           </w:p>
@@ -10207,7 +10263,7 @@
       <w:pPr>
         <w:pStyle w:val="Ttulo2"/>
       </w:pPr>
-      <w:bookmarkStart w:id="17" w:name="_Toc243644309"/>
+      <w:bookmarkStart w:id="17" w:name="_Toc243647087"/>
       <w:r>
         <w:t>6.7 Secciones y anclas</w:t>
       </w:r>
@@ -10620,7 +10676,7 @@
       <w:pPr>
         <w:pStyle w:val="Ttulo1"/>
       </w:pPr>
-      <w:bookmarkStart w:id="18" w:name="_Toc243644310"/>
+      <w:bookmarkStart w:id="18" w:name="_Toc243647088"/>
       <w:r>
         <w:lastRenderedPageBreak/>
         <w:t>7. Backend (Cloudflare Pages Functions)</w:t>
@@ -10631,7 +10687,7 @@
       <w:pPr>
         <w:pStyle w:val="Ttulo2"/>
       </w:pPr>
-      <w:bookmarkStart w:id="19" w:name="_Toc243644311"/>
+      <w:bookmarkStart w:id="19" w:name="_Toc243647089"/>
       <w:r>
         <w:t>7.1 Estructura</w:t>
       </w:r>
@@ -10726,7 +10782,7 @@
       <w:pPr>
         <w:pStyle w:val="Ttulo2"/>
       </w:pPr>
-      <w:bookmarkStart w:id="20" w:name="_Toc243644312"/>
+      <w:bookmarkStart w:id="20" w:name="_Toc243647090"/>
       <w:r>
         <w:t>7.2 Endpoints</w:t>
       </w:r>
@@ -11427,7 +11483,7 @@
       <w:pPr>
         <w:pStyle w:val="Ttulo2"/>
       </w:pPr>
-      <w:bookmarkStart w:id="21" w:name="_Toc243644313"/>
+      <w:bookmarkStart w:id="21" w:name="_Toc243647091"/>
       <w:r>
         <w:t>7.3 Autenticación y sesión</w:t>
       </w:r>
@@ -11675,7 +11731,7 @@
       <w:pPr>
         <w:pStyle w:val="Ttulo2"/>
       </w:pPr>
-      <w:bookmarkStart w:id="22" w:name="_Toc243644314"/>
+      <w:bookmarkStart w:id="22" w:name="_Toc243647092"/>
       <w:r>
         <w:t>7.4 Workers KV</w:t>
       </w:r>
@@ -12084,7 +12140,7 @@
       <w:pPr>
         <w:pStyle w:val="Ttulo2"/>
       </w:pPr>
-      <w:bookmarkStart w:id="23" w:name="_Toc243644315"/>
+      <w:bookmarkStart w:id="23" w:name="_Toc243647093"/>
       <w:r>
         <w:t>7.5 Validación del contenido</w:t>
       </w:r>
@@ -12227,7 +12283,7 @@
       <w:pPr>
         <w:pStyle w:val="Ttulo1"/>
       </w:pPr>
-      <w:bookmarkStart w:id="24" w:name="_Toc243644316"/>
+      <w:bookmarkStart w:id="24" w:name="_Toc243647094"/>
       <w:r>
         <w:lastRenderedPageBreak/>
         <w:t>8. Panel de administración</w:t>
@@ -12267,7 +12323,7 @@
       <w:pPr>
         <w:pStyle w:val="Ttulo2"/>
       </w:pPr>
-      <w:bookmarkStart w:id="25" w:name="_Toc243644317"/>
+      <w:bookmarkStart w:id="25" w:name="_Toc243647095"/>
       <w:r>
         <w:t>8.1 Ingreso</w:t>
       </w:r>
@@ -12348,7 +12404,7 @@
       <w:pPr>
         <w:pStyle w:val="Ttulo2"/>
       </w:pPr>
-      <w:bookmarkStart w:id="26" w:name="_Toc243644318"/>
+      <w:bookmarkStart w:id="26" w:name="_Toc243647096"/>
       <w:r>
         <w:t>8.2 Pestañas y acciones</w:t>
       </w:r>
@@ -12788,7 +12844,7 @@
       <w:pPr>
         <w:pStyle w:val="Ttulo1"/>
       </w:pPr>
-      <w:bookmarkStart w:id="27" w:name="_Toc243644319"/>
+      <w:bookmarkStart w:id="27" w:name="_Toc243647097"/>
       <w:r>
         <w:lastRenderedPageBreak/>
         <w:t>9. Build y despliegue</w:t>
@@ -12799,7 +12855,7 @@
       <w:pPr>
         <w:pStyle w:val="Ttulo2"/>
       </w:pPr>
-      <w:bookmarkStart w:id="28" w:name="_Toc243644320"/>
+      <w:bookmarkStart w:id="28" w:name="_Toc243647098"/>
       <w:r>
         <w:t>9.1 Comandos</w:t>
       </w:r>
@@ -12899,7 +12955,7 @@
       <w:pPr>
         <w:pStyle w:val="Ttulo2"/>
       </w:pPr>
-      <w:bookmarkStart w:id="29" w:name="_Toc243644321"/>
+      <w:bookmarkStart w:id="29" w:name="_Toc243647099"/>
       <w:r>
         <w:t>9.2 Configuración de Cloudflare (wrangler.toml)</w:t>
       </w:r>
@@ -13053,7 +13109,7 @@
       <w:pPr>
         <w:pStyle w:val="Ttulo2"/>
       </w:pPr>
-      <w:bookmarkStart w:id="30" w:name="_Toc243644322"/>
+      <w:bookmarkStart w:id="30" w:name="_Toc243647100"/>
       <w:r>
         <w:t>9.3 Proyecto, KV y secretos</w:t>
       </w:r>
@@ -13557,7 +13613,7 @@
       <w:pPr>
         <w:pStyle w:val="Ttulo2"/>
       </w:pPr>
-      <w:bookmarkStart w:id="31" w:name="_Toc243644323"/>
+      <w:bookmarkStart w:id="31" w:name="_Toc243647101"/>
       <w:r>
         <w:t>9.4 Cómo se actualiza el sitio</w:t>
       </w:r>
@@ -13748,7 +13804,7 @@
       <w:pPr>
         <w:pStyle w:val="Ttulo2"/>
       </w:pPr>
-      <w:bookmarkStart w:id="32" w:name="_Toc243644324"/>
+      <w:bookmarkStart w:id="32" w:name="_Toc243647102"/>
       <w:r>
         <w:t>9.5 Cambios de contenido (no requieren deploy)</w:t>
       </w:r>
@@ -13800,7 +13856,7 @@
       <w:pPr>
         <w:pStyle w:val="Ttulo1"/>
       </w:pPr>
-      <w:bookmarkStart w:id="33" w:name="_Toc243644325"/>
+      <w:bookmarkStart w:id="33" w:name="_Toc243647103"/>
       <w:r>
         <w:lastRenderedPageBreak/>
         <w:t>10. Pruebas y verificación</w:t>
@@ -13811,7 +13867,7 @@
       <w:pPr>
         <w:pStyle w:val="Ttulo2"/>
       </w:pPr>
-      <w:bookmarkStart w:id="34" w:name="_Toc243644326"/>
+      <w:bookmarkStart w:id="34" w:name="_Toc243647104"/>
       <w:r>
         <w:t>10.1 Pruebas automáticas de la API</w:t>
       </w:r>
@@ -14196,7 +14252,7 @@
       <w:pPr>
         <w:pStyle w:val="Ttulo2"/>
       </w:pPr>
-      <w:bookmarkStart w:id="35" w:name="_Toc243644327"/>
+      <w:bookmarkStart w:id="35" w:name="_Toc243647105"/>
       <w:r>
         <w:t>10.2 Verificación en producción (23/10/2026)</w:t>
       </w:r>
@@ -14259,7 +14315,7 @@
         <w:rPr>
           <w:rFonts w:cs="Calibri"/>
         </w:rPr>
-        <w:t>•  index.html, /images/logo.png, /fonts/edo.woff, /videos/entrenamiento.mp4 y /videos/intro-totalhiit.mp4 → 200. /admin → 200.</w:t>
+        <w:t>•  index.html, /images/logo_valen.jpeg, /fonts/edo.woff, /videos/entrenamiento.mp4 y /videos/intro-totalhiit.mp4 → 200. /admin → 200.</w:t>
       </w:r>
     </w:p>
     <w:p>
@@ -14312,7 +14368,7 @@
       <w:pPr>
         <w:pStyle w:val="Ttulo1"/>
       </w:pPr>
-      <w:bookmarkStart w:id="36" w:name="_Toc243644328"/>
+      <w:bookmarkStart w:id="36" w:name="_Toc243647106"/>
       <w:r>
         <w:lastRenderedPageBreak/>
         <w:t>11. Seguridad</w:t>
@@ -14481,7 +14537,7 @@
       <w:pPr>
         <w:pStyle w:val="Ttulo2"/>
       </w:pPr>
-      <w:bookmarkStart w:id="37" w:name="_Toc243644329"/>
+      <w:bookmarkStart w:id="37" w:name="_Toc243647107"/>
       <w:r>
         <w:t>11.1 Limitaciones conocidas</w:t>
       </w:r>
@@ -14565,7 +14621,7 @@
       <w:pPr>
         <w:pStyle w:val="Ttulo1"/>
       </w:pPr>
-      <w:bookmarkStart w:id="38" w:name="_Toc243644330"/>
+      <w:bookmarkStart w:id="38" w:name="_Toc243647108"/>
       <w:r>
         <w:lastRenderedPageBreak/>
         <w:t>12. Límites y consideraciones técnicas</w:t>
@@ -15079,7 +15135,7 @@
       <w:pPr>
         <w:pStyle w:val="Ttulo1"/>
       </w:pPr>
-      <w:bookmarkStart w:id="39" w:name="_Toc243644331"/>
+      <w:bookmarkStart w:id="39" w:name="_Toc243647109"/>
       <w:r>
         <w:lastRenderedPageBreak/>
         <w:t>13. Mantenimiento (guía rápida)</w:t>
@@ -15090,7 +15146,7 @@
       <w:pPr>
         <w:pStyle w:val="Ttulo2"/>
       </w:pPr>
-      <w:bookmarkStart w:id="40" w:name="_Toc243644332"/>
+      <w:bookmarkStart w:id="40" w:name="_Toc243647110"/>
       <w:r>
         <w:t>13.1 Cambiar precios, videos o imágenes del Hero</w:t>
       </w:r>
@@ -15173,7 +15229,7 @@
       <w:pPr>
         <w:pStyle w:val="Ttulo2"/>
       </w:pPr>
-      <w:bookmarkStart w:id="41" w:name="_Toc243644333"/>
+      <w:bookmarkStart w:id="41" w:name="_Toc243647111"/>
       <w:r>
         <w:t>13.2 Cambiar la clave del panel</w:t>
       </w:r>
@@ -15283,7 +15339,7 @@
       <w:pPr>
         <w:pStyle w:val="Ttulo2"/>
       </w:pPr>
-      <w:bookmarkStart w:id="42" w:name="_Toc243644334"/>
+      <w:bookmarkStart w:id="42" w:name="_Toc243647112"/>
       <w:r>
         <w:t>13.3 Publicar un cambio de código</w:t>
       </w:r>
@@ -15437,7 +15493,7 @@
       <w:pPr>
         <w:pStyle w:val="Ttulo2"/>
       </w:pPr>
-      <w:bookmarkStart w:id="43" w:name="_Toc243644335"/>
+      <w:bookmarkStart w:id="43" w:name="_Toc243647113"/>
       <w:r>
         <w:t>13.4 Reemplazar datos pendientes</w:t>
       </w:r>
@@ -15506,7 +15562,7 @@
       <w:pPr>
         <w:pStyle w:val="Ttulo1"/>
       </w:pPr>
-      <w:bookmarkStart w:id="44" w:name="_Toc243644336"/>
+      <w:bookmarkStart w:id="44" w:name="_Toc243647114"/>
       <w:r>
         <w:lastRenderedPageBreak/>
         <w:t>14. Hoja de ruta</w:t>
@@ -15920,7 +15976,7 @@
       <w:pPr>
         <w:pStyle w:val="Ttulo1"/>
       </w:pPr>
-      <w:bookmarkStart w:id="45" w:name="_Toc243644337"/>
+      <w:bookmarkStart w:id="45" w:name="_Toc243647115"/>
       <w:r>
         <w:lastRenderedPageBreak/>
         <w:t>15. Glosario</w:t>
@@ -17101,7 +17157,7 @@
     <w:link w:val="Ttulo1Car"/>
     <w:uiPriority w:val="9"/>
     <w:qFormat/>
-    <w:rsid w:val="00E22219"/>
+    <w:rsid w:val="00C027BB"/>
     <w:pPr>
       <w:keepNext/>
       <w:keepLines/>
@@ -17124,7 +17180,7 @@
     <w:uiPriority w:val="9"/>
     <w:unhideWhenUsed/>
     <w:qFormat/>
-    <w:rsid w:val="00E22219"/>
+    <w:rsid w:val="00C027BB"/>
     <w:pPr>
       <w:keepNext/>
       <w:keepLines/>
@@ -17147,7 +17203,7 @@
     <w:semiHidden/>
     <w:unhideWhenUsed/>
     <w:qFormat/>
-    <w:rsid w:val="00E22219"/>
+    <w:rsid w:val="00C027BB"/>
     <w:pPr>
       <w:keepNext/>
       <w:keepLines/>
@@ -17171,7 +17227,7 @@
     <w:semiHidden/>
     <w:unhideWhenUsed/>
     <w:qFormat/>
-    <w:rsid w:val="00E22219"/>
+    <w:rsid w:val="00C027BB"/>
     <w:pPr>
       <w:keepNext/>
       <w:keepLines/>
@@ -17194,7 +17250,7 @@
     <w:semiHidden/>
     <w:unhideWhenUsed/>
     <w:qFormat/>
-    <w:rsid w:val="00E22219"/>
+    <w:rsid w:val="00C027BB"/>
     <w:pPr>
       <w:keepNext/>
       <w:keepLines/>
@@ -17215,7 +17271,7 @@
     <w:semiHidden/>
     <w:unhideWhenUsed/>
     <w:qFormat/>
-    <w:rsid w:val="00E22219"/>
+    <w:rsid w:val="00C027BB"/>
     <w:pPr>
       <w:keepNext/>
       <w:keepLines/>
@@ -17238,7 +17294,7 @@
     <w:semiHidden/>
     <w:unhideWhenUsed/>
     <w:qFormat/>
-    <w:rsid w:val="00E22219"/>
+    <w:rsid w:val="00C027BB"/>
     <w:pPr>
       <w:keepNext/>
       <w:keepLines/>
@@ -17259,7 +17315,7 @@
     <w:semiHidden/>
     <w:unhideWhenUsed/>
     <w:qFormat/>
-    <w:rsid w:val="00E22219"/>
+    <w:rsid w:val="00C027BB"/>
     <w:pPr>
       <w:keepNext/>
       <w:keepLines/>
@@ -17282,7 +17338,7 @@
     <w:semiHidden/>
     <w:unhideWhenUsed/>
     <w:qFormat/>
-    <w:rsid w:val="00E22219"/>
+    <w:rsid w:val="00C027BB"/>
     <w:pPr>
       <w:keepNext/>
       <w:keepLines/>
@@ -17326,7 +17382,7 @@
     <w:basedOn w:val="Fuentedeprrafopredeter"/>
     <w:link w:val="Ttulo1"/>
     <w:uiPriority w:val="9"/>
-    <w:rsid w:val="00E22219"/>
+    <w:rsid w:val="00C027BB"/>
     <w:rPr>
       <w:rFonts w:ascii="Calibri" w:eastAsiaTheme="majorEastAsia" w:hAnsi="Calibri" w:cstheme="majorBidi"/>
       <w:b/>
@@ -17340,7 +17396,7 @@
     <w:basedOn w:val="Fuentedeprrafopredeter"/>
     <w:link w:val="Ttulo2"/>
     <w:uiPriority w:val="9"/>
-    <w:rsid w:val="00E22219"/>
+    <w:rsid w:val="00C027BB"/>
     <w:rPr>
       <w:rFonts w:ascii="Calibri" w:eastAsiaTheme="majorEastAsia" w:hAnsi="Calibri" w:cstheme="majorBidi"/>
       <w:b/>
@@ -17355,7 +17411,7 @@
     <w:link w:val="Ttulo3"/>
     <w:uiPriority w:val="9"/>
     <w:semiHidden/>
-    <w:rsid w:val="00E22219"/>
+    <w:rsid w:val="00C027BB"/>
     <w:rPr>
       <w:rFonts w:ascii="Calibri" w:eastAsiaTheme="majorEastAsia" w:hAnsi="Calibri" w:cstheme="majorBidi"/>
       <w:b/>
@@ -17370,7 +17426,7 @@
     <w:link w:val="Ttulo4"/>
     <w:uiPriority w:val="9"/>
     <w:semiHidden/>
-    <w:rsid w:val="00E22219"/>
+    <w:rsid w:val="00C027BB"/>
     <w:rPr>
       <w:rFonts w:eastAsiaTheme="majorEastAsia" w:cstheme="majorBidi"/>
       <w:i/>
@@ -17384,7 +17440,7 @@
     <w:link w:val="Ttulo5"/>
     <w:uiPriority w:val="9"/>
     <w:semiHidden/>
-    <w:rsid w:val="00E22219"/>
+    <w:rsid w:val="00C027BB"/>
     <w:rPr>
       <w:rFonts w:eastAsiaTheme="majorEastAsia" w:cstheme="majorBidi"/>
       <w:color w:val="0F4761" w:themeColor="accent1" w:themeShade="BF"/>
@@ -17396,7 +17452,7 @@
     <w:link w:val="Ttulo6"/>
     <w:uiPriority w:val="9"/>
     <w:semiHidden/>
-    <w:rsid w:val="00E22219"/>
+    <w:rsid w:val="00C027BB"/>
     <w:rPr>
       <w:rFonts w:eastAsiaTheme="majorEastAsia" w:cstheme="majorBidi"/>
       <w:i/>
@@ -17410,7 +17466,7 @@
     <w:link w:val="Ttulo7"/>
     <w:uiPriority w:val="9"/>
     <w:semiHidden/>
-    <w:rsid w:val="00E22219"/>
+    <w:rsid w:val="00C027BB"/>
     <w:rPr>
       <w:rFonts w:eastAsiaTheme="majorEastAsia" w:cstheme="majorBidi"/>
       <w:color w:val="595959" w:themeColor="text1" w:themeTint="A6"/>
@@ -17422,7 +17478,7 @@
     <w:link w:val="Ttulo8"/>
     <w:uiPriority w:val="9"/>
     <w:semiHidden/>
-    <w:rsid w:val="00E22219"/>
+    <w:rsid w:val="00C027BB"/>
     <w:rPr>
       <w:rFonts w:eastAsiaTheme="majorEastAsia" w:cstheme="majorBidi"/>
       <w:i/>
@@ -17436,7 +17492,7 @@
     <w:link w:val="Ttulo9"/>
     <w:uiPriority w:val="9"/>
     <w:semiHidden/>
-    <w:rsid w:val="00E22219"/>
+    <w:rsid w:val="00C027BB"/>
     <w:rPr>
       <w:rFonts w:eastAsiaTheme="majorEastAsia" w:cstheme="majorBidi"/>
       <w:color w:val="272727" w:themeColor="text1" w:themeTint="D8"/>
@@ -17449,7 +17505,7 @@
     <w:link w:val="TtuloCar"/>
     <w:uiPriority w:val="10"/>
     <w:qFormat/>
-    <w:rsid w:val="00E22219"/>
+    <w:rsid w:val="00C027BB"/>
     <w:pPr>
       <w:spacing w:after="80" w:line="240" w:lineRule="auto"/>
       <w:contextualSpacing/>
@@ -17467,7 +17523,7 @@
     <w:basedOn w:val="Fuentedeprrafopredeter"/>
     <w:link w:val="Ttulo"/>
     <w:uiPriority w:val="10"/>
-    <w:rsid w:val="00E22219"/>
+    <w:rsid w:val="00C027BB"/>
     <w:rPr>
       <w:rFonts w:asciiTheme="majorHAnsi" w:eastAsiaTheme="majorEastAsia" w:hAnsiTheme="majorHAnsi" w:cstheme="majorBidi"/>
       <w:spacing w:val="-10"/>
@@ -17483,7 +17539,7 @@
     <w:link w:val="SubttuloCar"/>
     <w:uiPriority w:val="11"/>
     <w:qFormat/>
-    <w:rsid w:val="00E22219"/>
+    <w:rsid w:val="00C027BB"/>
     <w:pPr>
       <w:numPr>
         <w:ilvl w:val="1"/>
@@ -17502,7 +17558,7 @@
     <w:basedOn w:val="Fuentedeprrafopredeter"/>
     <w:link w:val="Subttulo"/>
     <w:uiPriority w:val="11"/>
-    <w:rsid w:val="00E22219"/>
+    <w:rsid w:val="00C027BB"/>
     <w:rPr>
       <w:rFonts w:eastAsiaTheme="majorEastAsia" w:cstheme="majorBidi"/>
       <w:color w:val="595959" w:themeColor="text1" w:themeTint="A6"/>
@@ -17518,7 +17574,7 @@
     <w:link w:val="CitaCar"/>
     <w:uiPriority w:val="29"/>
     <w:qFormat/>
-    <w:rsid w:val="00E22219"/>
+    <w:rsid w:val="00C027BB"/>
     <w:pPr>
       <w:spacing w:before="160"/>
       <w:jc w:val="center"/>
@@ -17534,7 +17590,7 @@
     <w:basedOn w:val="Fuentedeprrafopredeter"/>
     <w:link w:val="Cita"/>
     <w:uiPriority w:val="29"/>
-    <w:rsid w:val="00E22219"/>
+    <w:rsid w:val="00C027BB"/>
     <w:rPr>
       <w:i/>
       <w:iCs/>
@@ -17546,7 +17602,7 @@
     <w:basedOn w:val="Normal"/>
     <w:uiPriority w:val="34"/>
     <w:qFormat/>
-    <w:rsid w:val="00E22219"/>
+    <w:rsid w:val="00C027BB"/>
     <w:pPr>
       <w:ind w:left="720"/>
       <w:contextualSpacing/>
@@ -17557,7 +17613,7 @@
     <w:basedOn w:val="Fuentedeprrafopredeter"/>
     <w:uiPriority w:val="21"/>
     <w:qFormat/>
-    <w:rsid w:val="00E22219"/>
+    <w:rsid w:val="00C027BB"/>
     <w:rPr>
       <w:i/>
       <w:iCs/>
@@ -17571,7 +17627,7 @@
     <w:link w:val="CitadestacadaCar"/>
     <w:uiPriority w:val="30"/>
     <w:qFormat/>
-    <w:rsid w:val="00E22219"/>
+    <w:rsid w:val="00C027BB"/>
     <w:pPr>
       <w:pBdr>
         <w:top w:val="single" w:sz="4" w:space="10" w:color="0F4761" w:themeColor="accent1" w:themeShade="BF"/>
@@ -17592,7 +17648,7 @@
     <w:basedOn w:val="Fuentedeprrafopredeter"/>
     <w:link w:val="Citadestacada"/>
     <w:uiPriority w:val="30"/>
-    <w:rsid w:val="00E22219"/>
+    <w:rsid w:val="00C027BB"/>
     <w:rPr>
       <w:i/>
       <w:iCs/>
@@ -17604,7 +17660,7 @@
     <w:basedOn w:val="Fuentedeprrafopredeter"/>
     <w:uiPriority w:val="32"/>
     <w:qFormat/>
-    <w:rsid w:val="00E22219"/>
+    <w:rsid w:val="00C027BB"/>
     <w:rPr>
       <w:b/>
       <w:bCs/>
@@ -17619,7 +17675,7 @@
     <w:link w:val="EncabezadoCar"/>
     <w:uiPriority w:val="99"/>
     <w:unhideWhenUsed/>
-    <w:rsid w:val="00E22219"/>
+    <w:rsid w:val="00C027BB"/>
     <w:pPr>
       <w:tabs>
         <w:tab w:val="center" w:pos="4252"/>
@@ -17633,7 +17689,7 @@
     <w:basedOn w:val="Fuentedeprrafopredeter"/>
     <w:link w:val="Encabezado"/>
     <w:uiPriority w:val="99"/>
-    <w:rsid w:val="00E22219"/>
+    <w:rsid w:val="00C027BB"/>
     <w:rPr>
       <w:rFonts w:ascii="Calibri" w:hAnsi="Calibri"/>
       <w:color w:val="202020"/>
@@ -17646,7 +17702,7 @@
     <w:link w:val="PiedepginaCar"/>
     <w:uiPriority w:val="99"/>
     <w:unhideWhenUsed/>
-    <w:rsid w:val="00E22219"/>
+    <w:rsid w:val="00C027BB"/>
     <w:pPr>
       <w:tabs>
         <w:tab w:val="center" w:pos="4252"/>
@@ -17660,7 +17716,7 @@
     <w:basedOn w:val="Fuentedeprrafopredeter"/>
     <w:link w:val="Piedepgina"/>
     <w:uiPriority w:val="99"/>
-    <w:rsid w:val="00E22219"/>
+    <w:rsid w:val="00C027BB"/>
     <w:rPr>
       <w:rFonts w:ascii="Calibri" w:hAnsi="Calibri"/>
       <w:color w:val="202020"/>
@@ -17674,7 +17730,7 @@
     <w:autoRedefine/>
     <w:uiPriority w:val="39"/>
     <w:unhideWhenUsed/>
-    <w:rsid w:val="00E22219"/>
+    <w:rsid w:val="00C027BB"/>
     <w:pPr>
       <w:spacing w:after="100"/>
     </w:pPr>
@@ -17686,7 +17742,7 @@
     <w:autoRedefine/>
     <w:uiPriority w:val="39"/>
     <w:unhideWhenUsed/>
-    <w:rsid w:val="00E22219"/>
+    <w:rsid w:val="00C027BB"/>
     <w:pPr>
       <w:spacing w:after="100"/>
       <w:ind w:left="210"/>

</xml_diff>